<commit_message>
Updated particle sim and Angry Blox for 2026
</commit_message>
<xml_diff>
--- a/Angry Blox/README.docx
+++ b/Angry Blox/README.docx
@@ -24,17 +24,8 @@
             <w:rStyle w:val="Hyperlink"/>
             <w:i/>
           </w:rPr>
-          <w:t xml:space="preserve">Boom </w:t>
+          <w:t>Boom Blox</w:t>
         </w:r>
-        <w:proofErr w:type="spellStart"/>
-        <w:r>
-          <w:rPr>
-            <w:rStyle w:val="Hyperlink"/>
-            <w:i/>
-          </w:rPr>
-          <w:t>Blox</w:t>
-        </w:r>
-        <w:proofErr w:type="spellEnd"/>
       </w:hyperlink>
       <w:r>
         <w:t xml:space="preserve"> (</w:t>
@@ -61,12 +52,68 @@
     <w:p>
       <w:pPr>
         <w:pStyle w:val="Heading1"/>
-      </w:pPr>
-      <w:proofErr w:type="spellStart"/>
+        <w:rPr>
+          <w:lang w:val="fr-FR"/>
+        </w:rPr>
+      </w:pPr>
+      <w:r>
+        <w:rPr>
+          <w:lang w:val="fr-FR"/>
+        </w:rPr>
+        <w:t>Important notes</w:t>
+      </w:r>
+    </w:p>
+    <w:p>
+      <w:pPr>
+        <w:pStyle w:val="ListParagraph"/>
+        <w:numPr>
+          <w:ilvl w:val="0"/>
+          <w:numId w:val="7"/>
+        </w:numPr>
+      </w:pPr>
+      <w:r>
+        <w:t xml:space="preserve">Remember to only use the official class version of Unity: </w:t>
+      </w:r>
+      <w:r>
+        <w:rPr>
+          <w:b/>
+          <w:bCs/>
+        </w:rPr>
+        <w:t>6000.6.4f1</w:t>
+      </w:r>
+      <w:r>
+        <w:t>.</w:t>
+      </w:r>
+    </w:p>
+    <w:p>
+      <w:pPr>
+        <w:pStyle w:val="ListParagraph"/>
+        <w:numPr>
+          <w:ilvl w:val="0"/>
+          <w:numId w:val="7"/>
+        </w:numPr>
+      </w:pPr>
+      <w:r>
+        <w:t>When running this assignment, be sure to set the Aspect Ratio pulldown in the editor to “</w:t>
+      </w:r>
+      <w:r>
+        <w:rPr>
+          <w:b/>
+          <w:bCs/>
+        </w:rPr>
+        <w:t>Full HD</w:t>
+      </w:r>
+      <w:r>
+        <w:t>”.  The dropdown is at the top of the Game/Scene window in the editor, right to the left of the Scale slider.</w:t>
+      </w:r>
+    </w:p>
+    <w:p>
+      <w:pPr>
+        <w:pStyle w:val="Heading1"/>
+      </w:pPr>
       <w:r>
         <w:t>ProjectileThrower.cs</w:t>
       </w:r>
-      <w:proofErr w:type="spellEnd"/>
     </w:p>
     <w:p>
       <w:r>
@@ -84,27 +131,11 @@
       <w:r>
         <w:t xml:space="preserve">Implement the procedure </w:t>
       </w:r>
-      <w:proofErr w:type="spellStart"/>
-      <w:proofErr w:type="gramStart"/>
-      <w:r>
-        <w:rPr>
-          <w:rFonts w:ascii="Consolas" w:hAnsi="Consolas"/>
-        </w:rPr>
-        <w:t>WaitingForPhysicsToSettle</w:t>
-      </w:r>
-      <w:proofErr w:type="spellEnd"/>
-      <w:r>
-        <w:rPr>
-          <w:rFonts w:ascii="Consolas" w:hAnsi="Consolas"/>
-        </w:rPr>
-        <w:t>(</w:t>
-      </w:r>
-      <w:proofErr w:type="gramEnd"/>
-      <w:r>
-        <w:rPr>
-          <w:rFonts w:ascii="Consolas" w:hAnsi="Consolas"/>
-        </w:rPr>
-        <w:t>)</w:t>
+      <w:r>
+        <w:rPr>
+          <w:rFonts w:ascii="Consolas" w:hAnsi="Consolas"/>
+        </w:rPr>
+        <w:t>WaitingForPhysicsToSettle()</w:t>
       </w:r>
       <w:r>
         <w:t xml:space="preserve"> so that it returns true if there is any RigidBody2D that is on screen and awake (in the physics sense).</w:t>
@@ -121,30 +152,14 @@
       <w:r>
         <w:t xml:space="preserve">Modify </w:t>
       </w:r>
-      <w:proofErr w:type="gramStart"/>
-      <w:r>
-        <w:rPr>
-          <w:rFonts w:ascii="Consolas" w:hAnsi="Consolas"/>
-        </w:rPr>
-        <w:t>Update(</w:t>
-      </w:r>
-      <w:proofErr w:type="gramEnd"/>
-      <w:r>
-        <w:rPr>
-          <w:rFonts w:ascii="Consolas" w:hAnsi="Consolas"/>
-        </w:rPr>
-        <w:t>)</w:t>
-      </w:r>
-      <w:r>
-        <w:t xml:space="preserve"> so that it reloads the level if the projectile has been fired (</w:t>
-      </w:r>
-      <w:proofErr w:type="spellStart"/>
-      <w:r>
-        <w:t>firingState</w:t>
-      </w:r>
-      <w:proofErr w:type="spellEnd"/>
-      <w:r>
-        <w:t xml:space="preserve"> is at Firing or beyond) and we aren’t waiting for physics to settle.</w:t>
+      <w:r>
+        <w:rPr>
+          <w:rFonts w:ascii="Consolas" w:hAnsi="Consolas"/>
+        </w:rPr>
+        <w:t>Update()</w:t>
+      </w:r>
+      <w:r>
+        <w:t xml:space="preserve"> so that it reloads the level if the projectile has been fired (firingState is at Firing or beyond) and we aren’t waiting for physics to settle.</w:t>
       </w:r>
     </w:p>
     <w:p>
@@ -158,19 +173,11 @@
       <w:r>
         <w:t xml:space="preserve">Modify </w:t>
       </w:r>
-      <w:proofErr w:type="gramStart"/>
-      <w:r>
-        <w:rPr>
-          <w:rFonts w:ascii="Consolas" w:hAnsi="Consolas"/>
-        </w:rPr>
-        <w:t>Update(</w:t>
-      </w:r>
-      <w:proofErr w:type="gramEnd"/>
-      <w:r>
-        <w:rPr>
-          <w:rFonts w:ascii="Consolas" w:hAnsi="Consolas"/>
-        </w:rPr>
-        <w:t>)</w:t>
+      <w:r>
+        <w:rPr>
+          <w:rFonts w:ascii="Consolas" w:hAnsi="Consolas"/>
+        </w:rPr>
+        <w:t>Update()</w:t>
       </w:r>
       <w:r>
         <w:t xml:space="preserve"> so it will also </w:t>
@@ -186,11 +193,9 @@
       <w:pPr>
         <w:pStyle w:val="Heading1"/>
       </w:pPr>
-      <w:proofErr w:type="spellStart"/>
       <w:r>
         <w:t>TargetBox.cs</w:t>
       </w:r>
-      <w:proofErr w:type="spellEnd"/>
     </w:p>
     <w:p>
       <w:r>
@@ -212,44 +217,22 @@
         <w:rPr>
           <w:rFonts w:ascii="Consolas" w:hAnsi="Consolas"/>
         </w:rPr>
-        <w:t>OnCollisionEnter2</w:t>
-      </w:r>
-      <w:proofErr w:type="gramStart"/>
-      <w:r>
-        <w:rPr>
-          <w:rFonts w:ascii="Consolas" w:hAnsi="Consolas"/>
-        </w:rPr>
-        <w:t>D</w:t>
-      </w:r>
-      <w:r>
-        <w:rPr>
-          <w:rFonts w:ascii="Consolas" w:hAnsi="Consolas"/>
-        </w:rPr>
-        <w:t>(</w:t>
-      </w:r>
-      <w:proofErr w:type="gramEnd"/>
-      <w:r>
-        <w:rPr>
-          <w:rFonts w:ascii="Consolas" w:hAnsi="Consolas"/>
-        </w:rPr>
-        <w:t>)</w:t>
+        <w:t>OnCollisionEnter2D</w:t>
+      </w:r>
+      <w:r>
+        <w:rPr>
+          <w:rFonts w:ascii="Consolas" w:hAnsi="Consolas"/>
+        </w:rPr>
+        <w:t>()</w:t>
       </w:r>
       <w:r>
         <w:t xml:space="preserve"> method to call the </w:t>
       </w:r>
-      <w:proofErr w:type="gramStart"/>
-      <w:r>
-        <w:rPr>
-          <w:rFonts w:ascii="Consolas" w:hAnsi="Consolas"/>
-        </w:rPr>
-        <w:t>Scored(</w:t>
-      </w:r>
-      <w:proofErr w:type="gramEnd"/>
-      <w:r>
-        <w:rPr>
-          <w:rFonts w:ascii="Consolas" w:hAnsi="Consolas"/>
-        </w:rPr>
-        <w:t>)</w:t>
+      <w:r>
+        <w:rPr>
+          <w:rFonts w:ascii="Consolas" w:hAnsi="Consolas"/>
+        </w:rPr>
+        <w:t>Scored()</w:t>
       </w:r>
       <w:r>
         <w:t xml:space="preserve"> procedure when the </w:t>
@@ -293,44 +276,39 @@
       <w:r>
         <w:t xml:space="preserve">Now write the </w:t>
       </w:r>
-      <w:proofErr w:type="gramStart"/>
-      <w:r>
-        <w:rPr>
-          <w:rFonts w:ascii="Consolas" w:hAnsi="Consolas"/>
-        </w:rPr>
-        <w:t>Scored(</w:t>
-      </w:r>
-      <w:proofErr w:type="gramEnd"/>
-      <w:r>
-        <w:rPr>
-          <w:rFonts w:ascii="Consolas" w:hAnsi="Consolas"/>
-        </w:rPr>
+      <w:r>
+        <w:rPr>
+          <w:rFonts w:ascii="Consolas" w:hAnsi="Consolas"/>
+        </w:rPr>
+        <w:t>Scored()</w:t>
+      </w:r>
+      <w:r>
+        <w:t xml:space="preserve"> procedure.  It should turn the target box green (set the </w:t>
+      </w:r>
+      <w:r>
+        <w:rPr>
+          <w:rFonts w:ascii="Consolas" w:hAnsi="Consolas"/>
+        </w:rPr>
+        <w:t>color</w:t>
+      </w:r>
+      <w:r>
+        <w:t xml:space="preserve"> field of the game object’s sprite renderer to green</w:t>
+      </w:r>
+      <w:r>
         <w:t>)</w:t>
       </w:r>
       <w:r>
-        <w:t xml:space="preserve"> procedure.  It should turn the target box green (set the </w:t>
-      </w:r>
-      <w:r>
-        <w:rPr>
-          <w:rFonts w:ascii="Consolas" w:hAnsi="Consolas"/>
-        </w:rPr>
-        <w:t>color</w:t>
-      </w:r>
-      <w:r>
-        <w:t xml:space="preserve"> field of the game object’s sprite renderer to green, and call </w:t>
-      </w:r>
-      <w:proofErr w:type="spellStart"/>
+        <w:t xml:space="preserve">, and call </w:t>
+      </w:r>
       <w:r>
         <w:rPr>
           <w:rFonts w:ascii="Consolas" w:hAnsi="Consolas"/>
         </w:rPr>
         <w:t>ScoreKeeper.AddToScore</w:t>
       </w:r>
-      <w:proofErr w:type="spellEnd"/>
       <w:r>
         <w:t xml:space="preserve">(float), passing it the mass of this </w:t>
       </w:r>
-      <w:proofErr w:type="spellStart"/>
       <w:r>
         <w:rPr>
           <w:rFonts w:ascii="Consolas" w:hAnsi="Consolas"/>
@@ -355,7 +333,6 @@
         </w:rPr>
         <w:t>ox</w:t>
       </w:r>
-      <w:proofErr w:type="spellEnd"/>
       <w:r>
         <w:t xml:space="preserve"> as an argument (so heavier things are worth more.</w:t>
       </w:r>
@@ -386,19 +363,11 @@
       <w:r>
         <w:t xml:space="preserve">uld only call </w:t>
       </w:r>
-      <w:proofErr w:type="spellStart"/>
-      <w:r>
-        <w:rPr>
-          <w:rFonts w:ascii="Consolas" w:hAnsi="Consolas"/>
-        </w:rPr>
-        <w:t>AddToScore</w:t>
-      </w:r>
-      <w:proofErr w:type="spellEnd"/>
-      <w:r>
-        <w:rPr>
-          <w:rFonts w:ascii="Consolas" w:hAnsi="Consolas"/>
-        </w:rPr>
-        <w:t>()</w:t>
+      <w:r>
+        <w:rPr>
+          <w:rFonts w:ascii="Consolas" w:hAnsi="Consolas"/>
+        </w:rPr>
+        <w:t>AddToScore()</w:t>
       </w:r>
       <w:r>
         <w:t xml:space="preserve"> once, when </w:t>
@@ -406,14 +375,12 @@
       <w:r>
         <w:t xml:space="preserve">that particular </w:t>
       </w:r>
-      <w:proofErr w:type="spellStart"/>
       <w:r>
         <w:rPr>
           <w:rFonts w:ascii="Consolas" w:hAnsi="Consolas"/>
         </w:rPr>
         <w:t>TargetBox</w:t>
       </w:r>
-      <w:proofErr w:type="spellEnd"/>
       <w:r>
         <w:t xml:space="preserve"> </w:t>
       </w:r>
@@ -439,25 +406,21 @@
       <w:r>
         <w:t xml:space="preserve">There is a second prefab, in addition to </w:t>
       </w:r>
-      <w:proofErr w:type="spellStart"/>
       <w:r>
         <w:rPr>
           <w:rFonts w:ascii="Consolas" w:hAnsi="Consolas"/>
         </w:rPr>
         <w:t>TargetBox</w:t>
       </w:r>
-      <w:proofErr w:type="spellEnd"/>
       <w:r>
         <w:t xml:space="preserve">, called </w:t>
       </w:r>
-      <w:proofErr w:type="spellStart"/>
       <w:r>
         <w:rPr>
           <w:rFonts w:ascii="Consolas" w:hAnsi="Consolas"/>
         </w:rPr>
         <w:t>ExplosiveBox</w:t>
       </w:r>
-      <w:proofErr w:type="spellEnd"/>
       <w:r>
         <w:t>.</w:t>
       </w:r>
@@ -491,14 +454,12 @@
       <w:r>
         <w:t xml:space="preserve"> and </w:t>
       </w:r>
-      <w:proofErr w:type="spellStart"/>
       <w:r>
         <w:rPr>
           <w:rFonts w:ascii="Consolas" w:hAnsi="Consolas"/>
         </w:rPr>
         <w:t>SpriteRenderer</w:t>
       </w:r>
-      <w:proofErr w:type="spellEnd"/>
       <w:r>
         <w:t xml:space="preserve"> as usual</w:t>
       </w:r>
@@ -512,6 +473,7 @@
         </w:numPr>
       </w:pPr>
       <w:r>
+        <w:lastRenderedPageBreak/>
         <w:t xml:space="preserve">A </w:t>
       </w:r>
       <w:r>
@@ -570,14 +532,12 @@
       <w:r>
         <w:t xml:space="preserve">Go to the </w:t>
       </w:r>
-      <w:proofErr w:type="spellStart"/>
       <w:r>
         <w:rPr>
           <w:rFonts w:ascii="Consolas" w:hAnsi="Consolas"/>
         </w:rPr>
         <w:t>Bomb.cs</w:t>
       </w:r>
-      <w:proofErr w:type="spellEnd"/>
       <w:r>
         <w:t xml:space="preserve"> file.  Add:</w:t>
       </w:r>
@@ -590,19 +550,12 @@
           <w:numId w:val="5"/>
         </w:numPr>
       </w:pPr>
-      <w:proofErr w:type="gramStart"/>
-      <w:r>
-        <w:lastRenderedPageBreak/>
-        <w:t>A method,</w:t>
-      </w:r>
-      <w:proofErr w:type="gramEnd"/>
-      <w:r>
-        <w:t xml:space="preserve"> let’</w:t>
+      <w:r>
+        <w:t>A method, let’</w:t>
       </w:r>
       <w:r>
         <w:t xml:space="preserve">s call it </w:t>
       </w:r>
-      <w:proofErr w:type="gramStart"/>
       <w:r>
         <w:rPr>
           <w:rFonts w:ascii="Consolas" w:hAnsi="Consolas"/>
@@ -613,17 +566,13 @@
         <w:rPr>
           <w:rFonts w:ascii="Consolas" w:hAnsi="Consolas"/>
         </w:rPr>
-        <w:t>(</w:t>
-      </w:r>
-      <w:proofErr w:type="gramEnd"/>
-      <w:r>
-        <w:rPr>
-          <w:rFonts w:ascii="Consolas" w:hAnsi="Consolas"/>
-        </w:rPr>
-        <w:t>)</w:t>
-      </w:r>
-      <w:r>
-        <w:t xml:space="preserve"> that destroys the box.</w:t>
+        <w:t>()</w:t>
+      </w:r>
+      <w:r>
+        <w:t xml:space="preserve">, </w:t>
+      </w:r>
+      <w:r>
+        <w:t>that destroys the box.</w:t>
       </w:r>
     </w:p>
     <w:p>
@@ -637,19 +586,11 @@
       <w:r>
         <w:t xml:space="preserve">A method, let’s call it </w:t>
       </w:r>
-      <w:proofErr w:type="gramStart"/>
-      <w:r>
-        <w:rPr>
-          <w:rFonts w:ascii="Consolas" w:hAnsi="Consolas"/>
-        </w:rPr>
-        <w:t>Boom(</w:t>
-      </w:r>
-      <w:proofErr w:type="gramEnd"/>
-      <w:r>
-        <w:rPr>
-          <w:rFonts w:ascii="Consolas" w:hAnsi="Consolas"/>
-        </w:rPr>
-        <w:t>)</w:t>
+      <w:r>
+        <w:rPr>
+          <w:rFonts w:ascii="Consolas" w:hAnsi="Consolas"/>
+        </w:rPr>
+        <w:t>Boom()</w:t>
       </w:r>
       <w:r>
         <w:t>, that makes the box blow up by:</w:t>
@@ -676,15 +617,7 @@
         </w:numPr>
       </w:pPr>
       <w:r>
-        <w:t xml:space="preserve">Turning off the box’s </w:t>
-      </w:r>
-      <w:proofErr w:type="spellStart"/>
-      <w:r>
-        <w:t>SpriteRenderer</w:t>
-      </w:r>
-      <w:proofErr w:type="spellEnd"/>
-      <w:r>
-        <w:t xml:space="preserve"> (so you can’t see the box part anymore)</w:t>
+        <w:t>Turning off the box’s SpriteRenderer (so you can’t see the box part anymore)</w:t>
       </w:r>
     </w:p>
     <w:p>
@@ -709,9 +642,17 @@
           <w:sz w:val="19"/>
           <w:szCs w:val="19"/>
         </w:rPr>
-        <w:t>Instantiate(</w:t>
-      </w:r>
-      <w:proofErr w:type="spellStart"/>
+        <w:t xml:space="preserve">Instantiate(ExplosionPrefab, transform.position, </w:t>
+      </w:r>
+      <w:r>
+        <w:rPr>
+          <w:rFonts w:ascii="Consolas" w:hAnsi="Consolas" w:cs="Consolas"/>
+          <w:color w:val="2B91AF"/>
+          <w:sz w:val="19"/>
+          <w:szCs w:val="19"/>
+        </w:rPr>
+        <w:t>Quaternion</w:t>
+      </w:r>
       <w:r>
         <w:rPr>
           <w:rFonts w:ascii="Consolas" w:hAnsi="Consolas" w:cs="Consolas"/>
@@ -719,9 +660,8 @@
           <w:sz w:val="19"/>
           <w:szCs w:val="19"/>
         </w:rPr>
-        <w:t>ExplosionPrefab</w:t>
-      </w:r>
-      <w:proofErr w:type="spellEnd"/>
+        <w:t xml:space="preserve">.identity, </w:t>
+      </w:r>
       <w:r>
         <w:rPr>
           <w:rFonts w:ascii="Consolas" w:hAnsi="Consolas" w:cs="Consolas"/>
@@ -729,86 +669,8 @@
           <w:sz w:val="19"/>
           <w:szCs w:val="19"/>
         </w:rPr>
-        <w:t xml:space="preserve">, </w:t>
-      </w:r>
-      <w:proofErr w:type="spellStart"/>
-      <w:r>
-        <w:rPr>
-          <w:rFonts w:ascii="Consolas" w:hAnsi="Consolas" w:cs="Consolas"/>
-          <w:color w:val="000000"/>
-          <w:sz w:val="19"/>
-          <w:szCs w:val="19"/>
-        </w:rPr>
-        <w:t>transform.position</w:t>
-      </w:r>
-      <w:proofErr w:type="spellEnd"/>
-      <w:r>
-        <w:rPr>
-          <w:rFonts w:ascii="Consolas" w:hAnsi="Consolas" w:cs="Consolas"/>
-          <w:color w:val="000000"/>
-          <w:sz w:val="19"/>
-          <w:szCs w:val="19"/>
-        </w:rPr>
-        <w:t xml:space="preserve">, </w:t>
-      </w:r>
-      <w:proofErr w:type="spellStart"/>
-      <w:r>
-        <w:rPr>
-          <w:rFonts w:ascii="Consolas" w:hAnsi="Consolas" w:cs="Consolas"/>
-          <w:color w:val="2B91AF"/>
-          <w:sz w:val="19"/>
-          <w:szCs w:val="19"/>
-        </w:rPr>
-        <w:t>Quaternion</w:t>
-      </w:r>
-      <w:r>
-        <w:rPr>
-          <w:rFonts w:ascii="Consolas" w:hAnsi="Consolas" w:cs="Consolas"/>
-          <w:color w:val="000000"/>
-          <w:sz w:val="19"/>
-          <w:szCs w:val="19"/>
-        </w:rPr>
-        <w:t>.identity</w:t>
-      </w:r>
-      <w:proofErr w:type="spellEnd"/>
-      <w:r>
-        <w:rPr>
-          <w:rFonts w:ascii="Consolas" w:hAnsi="Consolas" w:cs="Consolas"/>
-          <w:color w:val="000000"/>
-          <w:sz w:val="19"/>
-          <w:szCs w:val="19"/>
-        </w:rPr>
-        <w:t xml:space="preserve">, </w:t>
-      </w:r>
-      <w:r>
-        <w:rPr>
-          <w:rFonts w:ascii="Consolas" w:hAnsi="Consolas" w:cs="Consolas"/>
-          <w:color w:val="000000"/>
-          <w:sz w:val="19"/>
-          <w:szCs w:val="19"/>
-        </w:rPr>
         <w:br/>
-        <w:t xml:space="preserve">             </w:t>
-      </w:r>
-      <w:proofErr w:type="spellStart"/>
-      <w:r>
-        <w:rPr>
-          <w:rFonts w:ascii="Consolas" w:hAnsi="Consolas" w:cs="Consolas"/>
-          <w:color w:val="000000"/>
-          <w:sz w:val="19"/>
-          <w:szCs w:val="19"/>
-        </w:rPr>
-        <w:t>transform.parent</w:t>
-      </w:r>
-      <w:proofErr w:type="spellEnd"/>
-      <w:r>
-        <w:rPr>
-          <w:rFonts w:ascii="Consolas" w:hAnsi="Consolas" w:cs="Consolas"/>
-          <w:color w:val="000000"/>
-          <w:sz w:val="19"/>
-          <w:szCs w:val="19"/>
-        </w:rPr>
-        <w:t>);</w:t>
+        <w:t xml:space="preserve">             transform.parent);</w:t>
       </w:r>
       <w:r>
         <w:rPr>
@@ -832,15 +694,7 @@
         </w:numPr>
       </w:pPr>
       <w:r>
-        <w:t xml:space="preserve">Schedules a call to </w:t>
-      </w:r>
-      <w:proofErr w:type="gramStart"/>
-      <w:r>
-        <w:t>Destruct(</w:t>
-      </w:r>
-      <w:proofErr w:type="gramEnd"/>
-      <w:r>
-        <w:t xml:space="preserve">) to occur in 0.1 seconds.  You can do that using </w:t>
+        <w:t xml:space="preserve">Schedules a call to Destruct() to occur in 0.1 seconds.  You can do that using </w:t>
       </w:r>
       <w:hyperlink r:id="rId6" w:history="1">
         <w:r>
@@ -881,59 +735,19 @@
         <w:rPr>
           <w:rFonts w:ascii="Consolas" w:hAnsi="Consolas"/>
         </w:rPr>
-        <w:t>OnCollisionEnter2</w:t>
-      </w:r>
-      <w:proofErr w:type="gramStart"/>
-      <w:r>
-        <w:rPr>
-          <w:rFonts w:ascii="Consolas" w:hAnsi="Consolas"/>
-        </w:rPr>
-        <w:t>D(</w:t>
-      </w:r>
-      <w:proofErr w:type="gramEnd"/>
-      <w:r>
-        <w:rPr>
-          <w:rFonts w:ascii="Consolas" w:hAnsi="Consolas"/>
-        </w:rPr>
-        <w:t>)</w:t>
-      </w:r>
-      <w:r>
-        <w:t xml:space="preserve"> method that </w:t>
-      </w:r>
-      <w:proofErr w:type="gramStart"/>
-      <w:r>
-        <w:t>calls</w:t>
-      </w:r>
-      <w:proofErr w:type="gramEnd"/>
-      <w:r>
-        <w:t xml:space="preserve"> </w:t>
-      </w:r>
-      <w:proofErr w:type="gramStart"/>
-      <w:r>
-        <w:rPr>
-          <w:rFonts w:ascii="Consolas" w:hAnsi="Consolas"/>
-        </w:rPr>
-        <w:t>Boom(</w:t>
-      </w:r>
-      <w:proofErr w:type="gramEnd"/>
-      <w:r>
-        <w:rPr>
-          <w:rFonts w:ascii="Consolas" w:hAnsi="Consolas"/>
-        </w:rPr>
-        <w:t>)</w:t>
-      </w:r>
-      <w:r>
-        <w:t xml:space="preserve"> when an object hits the box with </w:t>
-      </w:r>
-      <w:proofErr w:type="spellStart"/>
-      <w:proofErr w:type="gramStart"/>
-      <w:r>
-        <w:t>a</w:t>
-      </w:r>
-      <w:proofErr w:type="spellEnd"/>
-      <w:proofErr w:type="gramEnd"/>
-      <w:r>
-        <w:t xml:space="preserve"> </w:t>
+        <w:t>OnCollisionEnter2D()</w:t>
+      </w:r>
+      <w:r>
+        <w:t xml:space="preserve"> method that calls </w:t>
+      </w:r>
+      <w:r>
+        <w:rPr>
+          <w:rFonts w:ascii="Consolas" w:hAnsi="Consolas"/>
+        </w:rPr>
+        <w:t>Boom()</w:t>
+      </w:r>
+      <w:r>
+        <w:t xml:space="preserve"> when an object hits the box with a </w:t>
       </w:r>
       <w:r>
         <w:t>impulse</w:t>
@@ -941,7 +755,6 @@
       <w:r>
         <w:t xml:space="preserve"> of at least </w:t>
       </w:r>
-      <w:proofErr w:type="spellStart"/>
       <w:r>
         <w:rPr>
           <w:rFonts w:ascii="Consolas" w:hAnsi="Consolas"/>
@@ -954,7 +767,6 @@
         </w:rPr>
         <w:t>Impulse</w:t>
       </w:r>
-      <w:proofErr w:type="spellEnd"/>
       <w:r>
         <w:t xml:space="preserve">.  </w:t>
       </w:r>
@@ -997,33 +809,21 @@
       <w:r>
         <w:t xml:space="preserve"> objects, each of which has a </w:t>
       </w:r>
-      <w:proofErr w:type="spellStart"/>
       <w:r>
         <w:rPr>
           <w:rFonts w:ascii="Consolas" w:hAnsi="Consolas"/>
         </w:rPr>
         <w:t>normalImpulse</w:t>
       </w:r>
-      <w:proofErr w:type="spellEnd"/>
-      <w:r>
-        <w:t xml:space="preserve"> field.  It’s called </w:t>
-      </w:r>
-      <w:proofErr w:type="spellStart"/>
-      <w:r>
-        <w:t>normalImpulse</w:t>
-      </w:r>
-      <w:proofErr w:type="spellEnd"/>
-      <w:r>
-        <w:t xml:space="preserve"> because the momentum is transferred perpendicular to the contact.  You should blow up if any contact has a normal impulse above </w:t>
-      </w:r>
-      <w:proofErr w:type="spellStart"/>
+      <w:r>
+        <w:t xml:space="preserve"> field.  It’s called normalImpulse because the momentum is transferred perpendicular to the contact.  You should blow up if any contact has a normal impulse above </w:t>
+      </w:r>
       <w:r>
         <w:rPr>
           <w:rFonts w:ascii="Consolas" w:hAnsi="Consolas"/>
         </w:rPr>
         <w:t>ThresholdImpulse</w:t>
       </w:r>
-      <w:proofErr w:type="spellEnd"/>
       <w:r>
         <w:t>.</w:t>
       </w:r>
@@ -1038,20 +838,18 @@
     </w:p>
     <w:p>
       <w:r>
-        <w:t>Now make at least one new level.  Experiment with different designs, and feel free to change parameters such as the mass of the projectile, or the strength of gravity.  You do not need to make more than one level, but at least one level should include one of your exploding boxes.</w:t>
-      </w:r>
-    </w:p>
-    <w:p>
-      <w:r>
-        <w:t xml:space="preserve">Try to make it </w:t>
-      </w:r>
-      <w:proofErr w:type="gramStart"/>
-      <w:r>
-        <w:t>engaging</w:t>
-      </w:r>
-      <w:proofErr w:type="gramEnd"/>
-      <w:r>
-        <w:t>; remember that your classmates will be playing it!</w:t>
+        <w:t xml:space="preserve">Now make at least one new level.  </w:t>
+      </w:r>
+      <w:r>
+        <w:t xml:space="preserve">Start by making a copy of the original level under a new name, remove the original blocks from the level, and then add new ones.  </w:t>
+      </w:r>
+      <w:r>
+        <w:t>Experiment with different designs, and feel free to change parameters such as the mass of the projectile, or the strength of gravity.  You do not need to make more than one level, but at least one level should include one of your exploding boxes.</w:t>
+      </w:r>
+    </w:p>
+    <w:p>
+      <w:r>
+        <w:t>Try to make it engaging; remember that your classmates will be playing it!</w:t>
       </w:r>
     </w:p>
     <w:p>
@@ -1064,7 +862,13 @@
     </w:p>
     <w:p>
       <w:r>
-        <w:t xml:space="preserve">Now you want to make sure you code doesn’t have any errors in it.  First, let’s make sure it compiles without any warnings.  In Visual Studio, choose </w:t>
+        <w:t xml:space="preserve">Now you want to make sure you code doesn’t have any errors in it.  First, let’s make sure it compiles without any warnings.  In </w:t>
+      </w:r>
+      <w:r>
+        <w:t>Rider</w:t>
+      </w:r>
+      <w:r>
+        <w:t xml:space="preserve">, choose </w:t>
       </w:r>
       <w:r>
         <w:rPr>
@@ -1076,41 +880,29 @@
       <w:r>
         <w:t xml:space="preserve"> from the menu and make sure the error list at the bottom of the window doesn’t have any errors or compiler warnings.</w:t>
       </w:r>
-    </w:p>
-    <w:p>
-      <w:r>
-        <w:t xml:space="preserve">Now go to the Unity window and find the Unity “Console”.  You’ll find it in the Console tab in the bottom pane of the window.  This is where exceptions get printed if your code throws and exception.  You can also display messages here manually using Unity’s </w:t>
-      </w:r>
-      <w:proofErr w:type="spellStart"/>
-      <w:r>
-        <w:rPr>
-          <w:rFonts w:ascii="Consolas" w:hAnsi="Consolas"/>
-        </w:rPr>
-        <w:t>Debug.Log</w:t>
-      </w:r>
-      <w:proofErr w:type="spellEnd"/>
-      <w:r>
-        <w:rPr>
-          <w:rFonts w:ascii="Consolas" w:hAnsi="Consolas"/>
-        </w:rPr>
-        <w:t>()</w:t>
+      <w:r>
+        <w:t xml:space="preserve">  If you get the warning CS8021 talking about “RuntimeMetadataVersion not found”, ignore that; it’s a unity issue.</w:t>
+      </w:r>
+    </w:p>
+    <w:p>
+      <w:r>
+        <w:lastRenderedPageBreak/>
+        <w:t xml:space="preserve">Now go to the Unity window and find the Unity “Console”.  You’ll find it in the Console tab in the bottom pane of the window.  This is where exceptions get printed if your code throws an exception.  You can also display messages here manually using Unity’s </w:t>
+      </w:r>
+      <w:r>
+        <w:rPr>
+          <w:rFonts w:ascii="Consolas" w:hAnsi="Consolas"/>
+        </w:rPr>
+        <w:t>Debug.Log()</w:t>
       </w:r>
       <w:r>
         <w:t xml:space="preserve"> method.  However, the final code you turn in for your project should not call </w:t>
       </w:r>
-      <w:proofErr w:type="spellStart"/>
-      <w:r>
-        <w:rPr>
-          <w:rFonts w:ascii="Consolas" w:hAnsi="Consolas"/>
-        </w:rPr>
-        <w:t>Debug.Log</w:t>
-      </w:r>
-      <w:proofErr w:type="spellEnd"/>
-      <w:r>
-        <w:rPr>
-          <w:rFonts w:ascii="Consolas" w:hAnsi="Consolas"/>
-        </w:rPr>
-        <w:t>()</w:t>
+      <w:r>
+        <w:rPr>
+          <w:rFonts w:ascii="Consolas" w:hAnsi="Consolas"/>
+        </w:rPr>
+        <w:t>Debug.Log()</w:t>
       </w:r>
       <w:r>
         <w:t xml:space="preserve"> or otherwise print any messages in the console window.</w:t>
@@ -1126,19 +918,11 @@
       <w:r>
         <w:t xml:space="preserve">for a minute or so, just to make sure no errors happen and you don’t have any </w:t>
       </w:r>
-      <w:proofErr w:type="spellStart"/>
-      <w:r>
-        <w:rPr>
-          <w:rFonts w:ascii="Consolas" w:hAnsi="Consolas"/>
-        </w:rPr>
-        <w:t>Debug.Log</w:t>
-      </w:r>
-      <w:proofErr w:type="spellEnd"/>
-      <w:r>
-        <w:rPr>
-          <w:rFonts w:ascii="Consolas" w:hAnsi="Consolas"/>
-        </w:rPr>
-        <w:t>()</w:t>
+      <w:r>
+        <w:rPr>
+          <w:rFonts w:ascii="Consolas" w:hAnsi="Consolas"/>
+        </w:rPr>
+        <w:t>Debug.Log()</w:t>
       </w:r>
       <w:r>
         <w:t xml:space="preserve"> calls left.</w:t>
@@ -1149,7 +933,6 @@
         <w:pStyle w:val="Heading1"/>
       </w:pPr>
       <w:r>
-        <w:lastRenderedPageBreak/>
         <w:t xml:space="preserve">IMPORTANT: </w:t>
       </w:r>
       <w:r>
@@ -1158,7 +941,25 @@
     </w:p>
     <w:p>
       <w:r>
-        <w:t>For this assignment, you’ll have to turn in your project, not just the CS files (because you’re making a new level).  To turn it in:</w:t>
+        <w:t xml:space="preserve">For this assignment, you’ll have to turn in your </w:t>
+      </w:r>
+      <w:r>
+        <w:t xml:space="preserve">full </w:t>
+      </w:r>
+      <w:r>
+        <w:t xml:space="preserve">project, not just the CS files (because you’re making a new level).  </w:t>
+      </w:r>
+      <w:r>
+        <w:t xml:space="preserve">That said, you DON’T want to turn in the all the folders because some are over a gigabyte.  </w:t>
+      </w:r>
+      <w:r>
+        <w:t xml:space="preserve">To turn </w:t>
+      </w:r>
+      <w:r>
+        <w:t>your project</w:t>
+      </w:r>
+      <w:r>
+        <w:t xml:space="preserve"> in:</w:t>
       </w:r>
     </w:p>
     <w:p>
@@ -1185,69 +986,72 @@
         <w:t xml:space="preserve">Copy </w:t>
       </w:r>
       <w:r>
-        <w:t xml:space="preserve">just </w:t>
-      </w:r>
-      <w:r>
-        <w:t xml:space="preserve">your </w:t>
-      </w:r>
-      <w:r>
         <w:rPr>
           <w:b/>
           <w:bCs/>
         </w:rPr>
-        <w:t>Assets</w:t>
-      </w:r>
-      <w:r>
-        <w:t xml:space="preserve">, </w:t>
+        <w:t>ONLY</w:t>
+      </w:r>
+      <w:r>
+        <w:t xml:space="preserve"> </w:t>
+      </w:r>
+      <w:r>
+        <w:t xml:space="preserve">your </w:t>
       </w:r>
       <w:r>
         <w:rPr>
           <w:b/>
           <w:bCs/>
         </w:rPr>
-        <w:t>Packages</w:t>
+        <w:t>Assets</w:t>
       </w:r>
       <w:r>
         <w:t xml:space="preserve">, </w:t>
       </w:r>
-      <w:proofErr w:type="spellStart"/>
       <w:r>
         <w:rPr>
           <w:b/>
           <w:bCs/>
         </w:rPr>
-        <w:t>ProjectSettings</w:t>
-      </w:r>
-      <w:proofErr w:type="spellEnd"/>
+        <w:t>Packages</w:t>
+      </w:r>
       <w:r>
         <w:t xml:space="preserve">, </w:t>
       </w:r>
-      <w:r>
-        <w:t xml:space="preserve">and </w:t>
-      </w:r>
-      <w:proofErr w:type="spellStart"/>
       <w:r>
         <w:rPr>
           <w:b/>
           <w:bCs/>
         </w:rPr>
-        <w:t>User</w:t>
+        <w:t>ProjectSettings</w:t>
+      </w:r>
+      <w:r>
+        <w:t xml:space="preserve">, </w:t>
+      </w:r>
+      <w:r>
+        <w:t xml:space="preserve">and </w:t>
       </w:r>
       <w:r>
         <w:rPr>
           <w:b/>
           <w:bCs/>
         </w:rPr>
-        <w:t>S</w:t>
+        <w:t>User</w:t>
       </w:r>
       <w:r>
         <w:rPr>
           <w:b/>
           <w:bCs/>
         </w:rPr>
+        <w:t>S</w:t>
+      </w:r>
+      <w:r>
+        <w:rPr>
+          <w:b/>
+          <w:bCs/>
+        </w:rPr>
         <w:t>ettings</w:t>
       </w:r>
-      <w:proofErr w:type="spellEnd"/>
       <w:r>
         <w:t xml:space="preserve"> directories into the new directory (copy, don’t move)</w:t>
       </w:r>
@@ -1561,6 +1365,119 @@
     </w:lvl>
   </w:abstractNum>
   <w:abstractNum w:abstractNumId="2" w15:restartNumberingAfterBreak="0">
+    <w:nsid w:val="2C921648"/>
+    <w:multiLevelType w:val="hybridMultilevel"/>
+    <w:tmpl w:val="04720C34"/>
+    <w:lvl w:ilvl="0" w:tplc="04090001">
+      <w:start w:val="1"/>
+      <w:numFmt w:val="bullet"/>
+      <w:lvlText w:val=""/>
+      <w:lvlJc w:val="left"/>
+      <w:pPr>
+        <w:ind w:left="720" w:hanging="360"/>
+      </w:pPr>
+      <w:rPr>
+        <w:rFonts w:ascii="Symbol" w:hAnsi="Symbol" w:hint="default"/>
+      </w:rPr>
+    </w:lvl>
+    <w:lvl w:ilvl="1" w:tplc="04090003" w:tentative="1">
+      <w:start w:val="1"/>
+      <w:numFmt w:val="bullet"/>
+      <w:lvlText w:val="o"/>
+      <w:lvlJc w:val="left"/>
+      <w:pPr>
+        <w:ind w:left="1440" w:hanging="360"/>
+      </w:pPr>
+      <w:rPr>
+        <w:rFonts w:ascii="Courier New" w:hAnsi="Courier New" w:cs="Courier New" w:hint="default"/>
+      </w:rPr>
+    </w:lvl>
+    <w:lvl w:ilvl="2" w:tplc="04090005" w:tentative="1">
+      <w:start w:val="1"/>
+      <w:numFmt w:val="bullet"/>
+      <w:lvlText w:val=""/>
+      <w:lvlJc w:val="left"/>
+      <w:pPr>
+        <w:ind w:left="2160" w:hanging="360"/>
+      </w:pPr>
+      <w:rPr>
+        <w:rFonts w:ascii="Wingdings" w:hAnsi="Wingdings" w:hint="default"/>
+      </w:rPr>
+    </w:lvl>
+    <w:lvl w:ilvl="3" w:tplc="04090001" w:tentative="1">
+      <w:start w:val="1"/>
+      <w:numFmt w:val="bullet"/>
+      <w:lvlText w:val=""/>
+      <w:lvlJc w:val="left"/>
+      <w:pPr>
+        <w:ind w:left="2880" w:hanging="360"/>
+      </w:pPr>
+      <w:rPr>
+        <w:rFonts w:ascii="Symbol" w:hAnsi="Symbol" w:hint="default"/>
+      </w:rPr>
+    </w:lvl>
+    <w:lvl w:ilvl="4" w:tplc="04090003" w:tentative="1">
+      <w:start w:val="1"/>
+      <w:numFmt w:val="bullet"/>
+      <w:lvlText w:val="o"/>
+      <w:lvlJc w:val="left"/>
+      <w:pPr>
+        <w:ind w:left="3600" w:hanging="360"/>
+      </w:pPr>
+      <w:rPr>
+        <w:rFonts w:ascii="Courier New" w:hAnsi="Courier New" w:cs="Courier New" w:hint="default"/>
+      </w:rPr>
+    </w:lvl>
+    <w:lvl w:ilvl="5" w:tplc="04090005" w:tentative="1">
+      <w:start w:val="1"/>
+      <w:numFmt w:val="bullet"/>
+      <w:lvlText w:val=""/>
+      <w:lvlJc w:val="left"/>
+      <w:pPr>
+        <w:ind w:left="4320" w:hanging="360"/>
+      </w:pPr>
+      <w:rPr>
+        <w:rFonts w:ascii="Wingdings" w:hAnsi="Wingdings" w:hint="default"/>
+      </w:rPr>
+    </w:lvl>
+    <w:lvl w:ilvl="6" w:tplc="04090001" w:tentative="1">
+      <w:start w:val="1"/>
+      <w:numFmt w:val="bullet"/>
+      <w:lvlText w:val=""/>
+      <w:lvlJc w:val="left"/>
+      <w:pPr>
+        <w:ind w:left="5040" w:hanging="360"/>
+      </w:pPr>
+      <w:rPr>
+        <w:rFonts w:ascii="Symbol" w:hAnsi="Symbol" w:hint="default"/>
+      </w:rPr>
+    </w:lvl>
+    <w:lvl w:ilvl="7" w:tplc="04090003" w:tentative="1">
+      <w:start w:val="1"/>
+      <w:numFmt w:val="bullet"/>
+      <w:lvlText w:val="o"/>
+      <w:lvlJc w:val="left"/>
+      <w:pPr>
+        <w:ind w:left="5760" w:hanging="360"/>
+      </w:pPr>
+      <w:rPr>
+        <w:rFonts w:ascii="Courier New" w:hAnsi="Courier New" w:cs="Courier New" w:hint="default"/>
+      </w:rPr>
+    </w:lvl>
+    <w:lvl w:ilvl="8" w:tplc="04090005" w:tentative="1">
+      <w:start w:val="1"/>
+      <w:numFmt w:val="bullet"/>
+      <w:lvlText w:val=""/>
+      <w:lvlJc w:val="left"/>
+      <w:pPr>
+        <w:ind w:left="6480" w:hanging="360"/>
+      </w:pPr>
+      <w:rPr>
+        <w:rFonts w:ascii="Wingdings" w:hAnsi="Wingdings" w:hint="default"/>
+      </w:rPr>
+    </w:lvl>
+  </w:abstractNum>
+  <w:abstractNum w:abstractNumId="3" w15:restartNumberingAfterBreak="0">
     <w:nsid w:val="2F7A1727"/>
     <w:multiLevelType w:val="hybridMultilevel"/>
     <w:tmpl w:val="EB327FB2"/>
@@ -1673,7 +1590,7 @@
       </w:rPr>
     </w:lvl>
   </w:abstractNum>
-  <w:abstractNum w:abstractNumId="3" w15:restartNumberingAfterBreak="0">
+  <w:abstractNum w:abstractNumId="4" w15:restartNumberingAfterBreak="0">
     <w:nsid w:val="38E72288"/>
     <w:multiLevelType w:val="hybridMultilevel"/>
     <w:tmpl w:val="EFAE7EF6"/>
@@ -1786,7 +1703,7 @@
       </w:rPr>
     </w:lvl>
   </w:abstractNum>
-  <w:abstractNum w:abstractNumId="4" w15:restartNumberingAfterBreak="0">
+  <w:abstractNum w:abstractNumId="5" w15:restartNumberingAfterBreak="0">
     <w:nsid w:val="39E65F20"/>
     <w:multiLevelType w:val="hybridMultilevel"/>
     <w:tmpl w:val="1EAADECC"/>
@@ -1899,7 +1816,7 @@
       </w:rPr>
     </w:lvl>
   </w:abstractNum>
-  <w:abstractNum w:abstractNumId="5" w15:restartNumberingAfterBreak="0">
+  <w:abstractNum w:abstractNumId="6" w15:restartNumberingAfterBreak="0">
     <w:nsid w:val="7AC3592C"/>
     <w:multiLevelType w:val="hybridMultilevel"/>
     <w:tmpl w:val="4FF02808"/>
@@ -2013,13 +1930,13 @@
     </w:lvl>
   </w:abstractNum>
   <w:num w:numId="1" w16cid:durableId="986207579">
+    <w:abstractNumId w:val="5"/>
+  </w:num>
+  <w:num w:numId="2" w16cid:durableId="1934975505">
     <w:abstractNumId w:val="4"/>
   </w:num>
-  <w:num w:numId="2" w16cid:durableId="1934975505">
+  <w:num w:numId="3" w16cid:durableId="919411689">
     <w:abstractNumId w:val="3"/>
-  </w:num>
-  <w:num w:numId="3" w16cid:durableId="919411689">
-    <w:abstractNumId w:val="2"/>
   </w:num>
   <w:num w:numId="4" w16cid:durableId="2064789349">
     <w:abstractNumId w:val="0"/>
@@ -2028,7 +1945,10 @@
     <w:abstractNumId w:val="1"/>
   </w:num>
   <w:num w:numId="6" w16cid:durableId="174005536">
-    <w:abstractNumId w:val="5"/>
+    <w:abstractNumId w:val="6"/>
+  </w:num>
+  <w:num w:numId="7" w16cid:durableId="1757938728">
+    <w:abstractNumId w:val="2"/>
   </w:num>
 </w:numbering>
 </file>

</xml_diff>